<commit_message>
docs(workbuddy-guide): tune slide layout, table widths; add PDF export of the deck
Co-authored-by: leiw92706436-del <leiw92706436-del@users.noreply.github.com>
</commit_message>
<xml_diff>
--- a/docs/workbuddy-guide/WorkBuddy仓库主管上手手册.docx
+++ b/docs/workbuddy-guide/WorkBuddy仓库主管上手手册.docx
@@ -119,17 +119,19 @@
         <w:tblStyle w:val="TableGrid"/>
         <w:tblW w:type="auto" w:w="0"/>
         <w:jc w:val="center"/>
+        <w:tblLayout w:type="fixed"/>
         <w:tblLook w:firstColumn="1" w:firstRow="1" w:lastColumn="0" w:lastRow="0" w:noHBand="0" w:noVBand="1" w:val="04A0"/>
+        <w:tblLayout w:type="fixed"/>
       </w:tblPr>
       <w:tblGrid>
-        <w:gridCol w:w="3249"/>
-        <w:gridCol w:w="3249"/>
-        <w:gridCol w:w="3249"/>
+        <w:gridCol w:w="1670"/>
+        <w:gridCol w:w="1670"/>
+        <w:gridCol w:w="6072"/>
       </w:tblGrid>
       <w:tr>
         <w:tc>
           <w:tcPr>
-            <w:tcW w:type="dxa" w:w="3249"/>
+            <w:tcW w:type="dxa" w:w="1670"/>
             <w:shd w:val="clear" w:color="auto" w:fill="2F3E5C"/>
           </w:tcPr>
           <w:p>
@@ -146,7 +148,7 @@
         </w:tc>
         <w:tc>
           <w:tcPr>
-            <w:tcW w:type="dxa" w:w="3249"/>
+            <w:tcW w:type="dxa" w:w="1670"/>
             <w:shd w:val="clear" w:color="auto" w:fill="2F3E5C"/>
           </w:tcPr>
           <w:p>
@@ -164,7 +166,7 @@
         </w:tc>
         <w:tc>
           <w:tcPr>
-            <w:tcW w:type="dxa" w:w="3249"/>
+            <w:tcW w:type="dxa" w:w="6072"/>
             <w:shd w:val="clear" w:color="auto" w:fill="2F3E5C"/>
           </w:tcPr>
           <w:p>
@@ -184,7 +186,7 @@
       <w:tr>
         <w:tc>
           <w:tcPr>
-            <w:tcW w:type="dxa" w:w="3249"/>
+            <w:tcW w:type="dxa" w:w="1670"/>
           </w:tcPr>
           <w:p>
             <w:r/>
@@ -200,7 +202,7 @@
         </w:tc>
         <w:tc>
           <w:tcPr>
-            <w:tcW w:type="dxa" w:w="3249"/>
+            <w:tcW w:type="dxa" w:w="1670"/>
           </w:tcPr>
           <w:p>
             <w:r/>
@@ -216,7 +218,7 @@
         </w:tc>
         <w:tc>
           <w:tcPr>
-            <w:tcW w:type="dxa" w:w="3249"/>
+            <w:tcW w:type="dxa" w:w="6072"/>
           </w:tcPr>
           <w:p>
             <w:r/>
@@ -234,7 +236,7 @@
       <w:tr>
         <w:tc>
           <w:tcPr>
-            <w:tcW w:type="dxa" w:w="3249"/>
+            <w:tcW w:type="dxa" w:w="1670"/>
             <w:shd w:val="clear" w:color="auto" w:fill="F8F9FB"/>
           </w:tcPr>
           <w:p>
@@ -251,7 +253,7 @@
         </w:tc>
         <w:tc>
           <w:tcPr>
-            <w:tcW w:type="dxa" w:w="3249"/>
+            <w:tcW w:type="dxa" w:w="1670"/>
             <w:shd w:val="clear" w:color="auto" w:fill="F8F9FB"/>
           </w:tcPr>
           <w:p>
@@ -268,7 +270,7 @@
         </w:tc>
         <w:tc>
           <w:tcPr>
-            <w:tcW w:type="dxa" w:w="3249"/>
+            <w:tcW w:type="dxa" w:w="6072"/>
             <w:shd w:val="clear" w:color="auto" w:fill="F8F9FB"/>
           </w:tcPr>
           <w:p>
@@ -287,7 +289,7 @@
       <w:tr>
         <w:tc>
           <w:tcPr>
-            <w:tcW w:type="dxa" w:w="3249"/>
+            <w:tcW w:type="dxa" w:w="1670"/>
           </w:tcPr>
           <w:p>
             <w:r/>
@@ -303,7 +305,7 @@
         </w:tc>
         <w:tc>
           <w:tcPr>
-            <w:tcW w:type="dxa" w:w="3249"/>
+            <w:tcW w:type="dxa" w:w="1670"/>
           </w:tcPr>
           <w:p>
             <w:r/>
@@ -319,7 +321,7 @@
         </w:tc>
         <w:tc>
           <w:tcPr>
-            <w:tcW w:type="dxa" w:w="3249"/>
+            <w:tcW w:type="dxa" w:w="6072"/>
           </w:tcPr>
           <w:p>
             <w:r/>
@@ -337,7 +339,7 @@
       <w:tr>
         <w:tc>
           <w:tcPr>
-            <w:tcW w:type="dxa" w:w="3249"/>
+            <w:tcW w:type="dxa" w:w="1670"/>
             <w:shd w:val="clear" w:color="auto" w:fill="F8F9FB"/>
           </w:tcPr>
           <w:p>
@@ -354,7 +356,7 @@
         </w:tc>
         <w:tc>
           <w:tcPr>
-            <w:tcW w:type="dxa" w:w="3249"/>
+            <w:tcW w:type="dxa" w:w="1670"/>
             <w:shd w:val="clear" w:color="auto" w:fill="F8F9FB"/>
           </w:tcPr>
           <w:p>
@@ -371,7 +373,7 @@
         </w:tc>
         <w:tc>
           <w:tcPr>
-            <w:tcW w:type="dxa" w:w="3249"/>
+            <w:tcW w:type="dxa" w:w="6072"/>
             <w:shd w:val="clear" w:color="auto" w:fill="F8F9FB"/>
           </w:tcPr>
           <w:p>
@@ -390,7 +392,7 @@
       <w:tr>
         <w:tc>
           <w:tcPr>
-            <w:tcW w:type="dxa" w:w="3249"/>
+            <w:tcW w:type="dxa" w:w="1670"/>
           </w:tcPr>
           <w:p>
             <w:r/>
@@ -406,7 +408,7 @@
         </w:tc>
         <w:tc>
           <w:tcPr>
-            <w:tcW w:type="dxa" w:w="3249"/>
+            <w:tcW w:type="dxa" w:w="1670"/>
           </w:tcPr>
           <w:p>
             <w:r/>
@@ -422,7 +424,7 @@
         </w:tc>
         <w:tc>
           <w:tcPr>
-            <w:tcW w:type="dxa" w:w="3249"/>
+            <w:tcW w:type="dxa" w:w="6072"/>
           </w:tcPr>
           <w:p>
             <w:r/>
@@ -687,18 +689,20 @@
         <w:tblStyle w:val="TableGrid"/>
         <w:tblW w:type="auto" w:w="0"/>
         <w:jc w:val="center"/>
+        <w:tblLayout w:type="fixed"/>
         <w:tblLook w:firstColumn="1" w:firstRow="1" w:lastColumn="0" w:lastRow="0" w:noHBand="0" w:noVBand="1" w:val="04A0"/>
+        <w:tblLayout w:type="fixed"/>
       </w:tblPr>
       <w:tblGrid>
-        <w:gridCol w:w="2436"/>
-        <w:gridCol w:w="2436"/>
-        <w:gridCol w:w="2436"/>
-        <w:gridCol w:w="2436"/>
+        <w:gridCol w:w="1522"/>
+        <w:gridCol w:w="1799"/>
+        <w:gridCol w:w="4567"/>
+        <w:gridCol w:w="1522"/>
       </w:tblGrid>
       <w:tr>
         <w:tc>
           <w:tcPr>
-            <w:tcW w:type="dxa" w:w="2436"/>
+            <w:tcW w:type="dxa" w:w="1522"/>
             <w:shd w:val="clear" w:color="auto" w:fill="2F3E5C"/>
           </w:tcPr>
           <w:p>
@@ -716,7 +720,7 @@
         </w:tc>
         <w:tc>
           <w:tcPr>
-            <w:tcW w:type="dxa" w:w="2436"/>
+            <w:tcW w:type="dxa" w:w="1799"/>
             <w:shd w:val="clear" w:color="auto" w:fill="2F3E5C"/>
           </w:tcPr>
           <w:p>
@@ -734,7 +738,7 @@
         </w:tc>
         <w:tc>
           <w:tcPr>
-            <w:tcW w:type="dxa" w:w="2436"/>
+            <w:tcW w:type="dxa" w:w="4567"/>
             <w:shd w:val="clear" w:color="auto" w:fill="2F3E5C"/>
           </w:tcPr>
           <w:p>
@@ -752,7 +756,7 @@
         </w:tc>
         <w:tc>
           <w:tcPr>
-            <w:tcW w:type="dxa" w:w="2436"/>
+            <w:tcW w:type="dxa" w:w="1522"/>
             <w:shd w:val="clear" w:color="auto" w:fill="2F3E5C"/>
           </w:tcPr>
           <w:p>
@@ -772,7 +776,7 @@
       <w:tr>
         <w:tc>
           <w:tcPr>
-            <w:tcW w:type="dxa" w:w="2436"/>
+            <w:tcW w:type="dxa" w:w="1522"/>
           </w:tcPr>
           <w:p>
             <w:r/>
@@ -788,7 +792,7 @@
         </w:tc>
         <w:tc>
           <w:tcPr>
-            <w:tcW w:type="dxa" w:w="2436"/>
+            <w:tcW w:type="dxa" w:w="1799"/>
           </w:tcPr>
           <w:p>
             <w:r/>
@@ -804,7 +808,7 @@
         </w:tc>
         <w:tc>
           <w:tcPr>
-            <w:tcW w:type="dxa" w:w="2436"/>
+            <w:tcW w:type="dxa" w:w="4567"/>
           </w:tcPr>
           <w:p>
             <w:r/>
@@ -820,7 +824,7 @@
         </w:tc>
         <w:tc>
           <w:tcPr>
-            <w:tcW w:type="dxa" w:w="2436"/>
+            <w:tcW w:type="dxa" w:w="1522"/>
           </w:tcPr>
           <w:p>
             <w:r/>
@@ -838,7 +842,7 @@
       <w:tr>
         <w:tc>
           <w:tcPr>
-            <w:tcW w:type="dxa" w:w="2436"/>
+            <w:tcW w:type="dxa" w:w="1522"/>
             <w:shd w:val="clear" w:color="auto" w:fill="F8F9FB"/>
           </w:tcPr>
           <w:p>
@@ -855,7 +859,7 @@
         </w:tc>
         <w:tc>
           <w:tcPr>
-            <w:tcW w:type="dxa" w:w="2436"/>
+            <w:tcW w:type="dxa" w:w="1799"/>
             <w:shd w:val="clear" w:color="auto" w:fill="F8F9FB"/>
           </w:tcPr>
           <w:p>
@@ -872,7 +876,7 @@
         </w:tc>
         <w:tc>
           <w:tcPr>
-            <w:tcW w:type="dxa" w:w="2436"/>
+            <w:tcW w:type="dxa" w:w="4567"/>
             <w:shd w:val="clear" w:color="auto" w:fill="F8F9FB"/>
           </w:tcPr>
           <w:p>
@@ -889,7 +893,7 @@
         </w:tc>
         <w:tc>
           <w:tcPr>
-            <w:tcW w:type="dxa" w:w="2436"/>
+            <w:tcW w:type="dxa" w:w="1522"/>
             <w:shd w:val="clear" w:color="auto" w:fill="F8F9FB"/>
           </w:tcPr>
           <w:p>
@@ -908,7 +912,7 @@
       <w:tr>
         <w:tc>
           <w:tcPr>
-            <w:tcW w:type="dxa" w:w="2436"/>
+            <w:tcW w:type="dxa" w:w="1522"/>
           </w:tcPr>
           <w:p>
             <w:r/>
@@ -924,7 +928,7 @@
         </w:tc>
         <w:tc>
           <w:tcPr>
-            <w:tcW w:type="dxa" w:w="2436"/>
+            <w:tcW w:type="dxa" w:w="1799"/>
           </w:tcPr>
           <w:p>
             <w:r/>
@@ -940,7 +944,7 @@
         </w:tc>
         <w:tc>
           <w:tcPr>
-            <w:tcW w:type="dxa" w:w="2436"/>
+            <w:tcW w:type="dxa" w:w="4567"/>
           </w:tcPr>
           <w:p>
             <w:r/>
@@ -956,7 +960,7 @@
         </w:tc>
         <w:tc>
           <w:tcPr>
-            <w:tcW w:type="dxa" w:w="2436"/>
+            <w:tcW w:type="dxa" w:w="1522"/>
           </w:tcPr>
           <w:p>
             <w:r/>
@@ -1024,17 +1028,19 @@
         <w:tblStyle w:val="TableGrid"/>
         <w:tblW w:type="auto" w:w="0"/>
         <w:jc w:val="center"/>
+        <w:tblLayout w:type="fixed"/>
         <w:tblLook w:firstColumn="1" w:firstRow="1" w:lastColumn="0" w:lastRow="0" w:noHBand="0" w:noVBand="1" w:val="04A0"/>
+        <w:tblLayout w:type="fixed"/>
       </w:tblPr>
       <w:tblGrid>
-        <w:gridCol w:w="3249"/>
-        <w:gridCol w:w="3249"/>
-        <w:gridCol w:w="3249"/>
+        <w:gridCol w:w="1344"/>
+        <w:gridCol w:w="3178"/>
+        <w:gridCol w:w="4889"/>
       </w:tblGrid>
       <w:tr>
         <w:tc>
           <w:tcPr>
-            <w:tcW w:type="dxa" w:w="3249"/>
+            <w:tcW w:type="dxa" w:w="1344"/>
             <w:shd w:val="clear" w:color="auto" w:fill="2F3E5C"/>
           </w:tcPr>
           <w:p>
@@ -1052,7 +1058,7 @@
         </w:tc>
         <w:tc>
           <w:tcPr>
-            <w:tcW w:type="dxa" w:w="3249"/>
+            <w:tcW w:type="dxa" w:w="3178"/>
             <w:shd w:val="clear" w:color="auto" w:fill="2F3E5C"/>
           </w:tcPr>
           <w:p>
@@ -1070,7 +1076,7 @@
         </w:tc>
         <w:tc>
           <w:tcPr>
-            <w:tcW w:type="dxa" w:w="3249"/>
+            <w:tcW w:type="dxa" w:w="4889"/>
             <w:shd w:val="clear" w:color="auto" w:fill="2F3E5C"/>
           </w:tcPr>
           <w:p>
@@ -1090,7 +1096,7 @@
       <w:tr>
         <w:tc>
           <w:tcPr>
-            <w:tcW w:type="dxa" w:w="3249"/>
+            <w:tcW w:type="dxa" w:w="1344"/>
           </w:tcPr>
           <w:p>
             <w:r/>
@@ -1106,7 +1112,7 @@
         </w:tc>
         <w:tc>
           <w:tcPr>
-            <w:tcW w:type="dxa" w:w="3249"/>
+            <w:tcW w:type="dxa" w:w="3178"/>
           </w:tcPr>
           <w:p>
             <w:r/>
@@ -1122,7 +1128,7 @@
         </w:tc>
         <w:tc>
           <w:tcPr>
-            <w:tcW w:type="dxa" w:w="3249"/>
+            <w:tcW w:type="dxa" w:w="4889"/>
           </w:tcPr>
           <w:p>
             <w:r/>
@@ -1140,7 +1146,7 @@
       <w:tr>
         <w:tc>
           <w:tcPr>
-            <w:tcW w:type="dxa" w:w="3249"/>
+            <w:tcW w:type="dxa" w:w="1344"/>
             <w:shd w:val="clear" w:color="auto" w:fill="F8F9FB"/>
           </w:tcPr>
           <w:p>
@@ -1157,7 +1163,7 @@
         </w:tc>
         <w:tc>
           <w:tcPr>
-            <w:tcW w:type="dxa" w:w="3249"/>
+            <w:tcW w:type="dxa" w:w="3178"/>
             <w:shd w:val="clear" w:color="auto" w:fill="F8F9FB"/>
           </w:tcPr>
           <w:p>
@@ -1174,7 +1180,7 @@
         </w:tc>
         <w:tc>
           <w:tcPr>
-            <w:tcW w:type="dxa" w:w="3249"/>
+            <w:tcW w:type="dxa" w:w="4889"/>
             <w:shd w:val="clear" w:color="auto" w:fill="F8F9FB"/>
           </w:tcPr>
           <w:p>
@@ -1193,7 +1199,7 @@
       <w:tr>
         <w:tc>
           <w:tcPr>
-            <w:tcW w:type="dxa" w:w="3249"/>
+            <w:tcW w:type="dxa" w:w="1344"/>
           </w:tcPr>
           <w:p>
             <w:r/>
@@ -1209,7 +1215,7 @@
         </w:tc>
         <w:tc>
           <w:tcPr>
-            <w:tcW w:type="dxa" w:w="3249"/>
+            <w:tcW w:type="dxa" w:w="3178"/>
           </w:tcPr>
           <w:p>
             <w:r/>
@@ -1225,7 +1231,7 @@
         </w:tc>
         <w:tc>
           <w:tcPr>
-            <w:tcW w:type="dxa" w:w="3249"/>
+            <w:tcW w:type="dxa" w:w="4889"/>
           </w:tcPr>
           <w:p>
             <w:r/>
@@ -1243,7 +1249,7 @@
       <w:tr>
         <w:tc>
           <w:tcPr>
-            <w:tcW w:type="dxa" w:w="3249"/>
+            <w:tcW w:type="dxa" w:w="1344"/>
             <w:shd w:val="clear" w:color="auto" w:fill="F8F9FB"/>
           </w:tcPr>
           <w:p>
@@ -1260,7 +1266,7 @@
         </w:tc>
         <w:tc>
           <w:tcPr>
-            <w:tcW w:type="dxa" w:w="3249"/>
+            <w:tcW w:type="dxa" w:w="3178"/>
             <w:shd w:val="clear" w:color="auto" w:fill="F8F9FB"/>
           </w:tcPr>
           <w:p>
@@ -1277,7 +1283,7 @@
         </w:tc>
         <w:tc>
           <w:tcPr>
-            <w:tcW w:type="dxa" w:w="3249"/>
+            <w:tcW w:type="dxa" w:w="4889"/>
             <w:shd w:val="clear" w:color="auto" w:fill="F8F9FB"/>
           </w:tcPr>
           <w:p>
@@ -1359,17 +1365,19 @@
         <w:tblStyle w:val="TableGrid"/>
         <w:tblW w:type="auto" w:w="0"/>
         <w:jc w:val="center"/>
+        <w:tblLayout w:type="fixed"/>
         <w:tblLook w:firstColumn="1" w:firstRow="1" w:lastColumn="0" w:lastRow="0" w:noHBand="0" w:noVBand="1" w:val="04A0"/>
+        <w:tblLayout w:type="fixed"/>
       </w:tblPr>
       <w:tblGrid>
-        <w:gridCol w:w="3249"/>
-        <w:gridCol w:w="3249"/>
-        <w:gridCol w:w="3249"/>
+        <w:gridCol w:w="1522"/>
+        <w:gridCol w:w="2768"/>
+        <w:gridCol w:w="5121"/>
       </w:tblGrid>
       <w:tr>
         <w:tc>
           <w:tcPr>
-            <w:tcW w:type="dxa" w:w="3249"/>
+            <w:tcW w:type="dxa" w:w="1522"/>
             <w:shd w:val="clear" w:color="auto" w:fill="2F3E5C"/>
           </w:tcPr>
           <w:p>
@@ -1387,7 +1395,7 @@
         </w:tc>
         <w:tc>
           <w:tcPr>
-            <w:tcW w:type="dxa" w:w="3249"/>
+            <w:tcW w:type="dxa" w:w="2768"/>
             <w:shd w:val="clear" w:color="auto" w:fill="2F3E5C"/>
           </w:tcPr>
           <w:p>
@@ -1405,7 +1413,7 @@
         </w:tc>
         <w:tc>
           <w:tcPr>
-            <w:tcW w:type="dxa" w:w="3249"/>
+            <w:tcW w:type="dxa" w:w="5121"/>
             <w:shd w:val="clear" w:color="auto" w:fill="2F3E5C"/>
           </w:tcPr>
           <w:p>
@@ -1425,7 +1433,7 @@
       <w:tr>
         <w:tc>
           <w:tcPr>
-            <w:tcW w:type="dxa" w:w="3249"/>
+            <w:tcW w:type="dxa" w:w="1522"/>
           </w:tcPr>
           <w:p>
             <w:r/>
@@ -1441,7 +1449,7 @@
         </w:tc>
         <w:tc>
           <w:tcPr>
-            <w:tcW w:type="dxa" w:w="3249"/>
+            <w:tcW w:type="dxa" w:w="2768"/>
           </w:tcPr>
           <w:p>
             <w:r/>
@@ -1457,7 +1465,7 @@
         </w:tc>
         <w:tc>
           <w:tcPr>
-            <w:tcW w:type="dxa" w:w="3249"/>
+            <w:tcW w:type="dxa" w:w="5121"/>
           </w:tcPr>
           <w:p>
             <w:r/>
@@ -1475,7 +1483,7 @@
       <w:tr>
         <w:tc>
           <w:tcPr>
-            <w:tcW w:type="dxa" w:w="3249"/>
+            <w:tcW w:type="dxa" w:w="1522"/>
             <w:shd w:val="clear" w:color="auto" w:fill="F8F9FB"/>
           </w:tcPr>
           <w:p>
@@ -1492,7 +1500,7 @@
         </w:tc>
         <w:tc>
           <w:tcPr>
-            <w:tcW w:type="dxa" w:w="3249"/>
+            <w:tcW w:type="dxa" w:w="2768"/>
             <w:shd w:val="clear" w:color="auto" w:fill="F8F9FB"/>
           </w:tcPr>
           <w:p>
@@ -1509,7 +1517,7 @@
         </w:tc>
         <w:tc>
           <w:tcPr>
-            <w:tcW w:type="dxa" w:w="3249"/>
+            <w:tcW w:type="dxa" w:w="5121"/>
             <w:shd w:val="clear" w:color="auto" w:fill="F8F9FB"/>
           </w:tcPr>
           <w:p>
@@ -1528,7 +1536,7 @@
       <w:tr>
         <w:tc>
           <w:tcPr>
-            <w:tcW w:type="dxa" w:w="3249"/>
+            <w:tcW w:type="dxa" w:w="1522"/>
           </w:tcPr>
           <w:p>
             <w:r/>
@@ -1544,7 +1552,7 @@
         </w:tc>
         <w:tc>
           <w:tcPr>
-            <w:tcW w:type="dxa" w:w="3249"/>
+            <w:tcW w:type="dxa" w:w="2768"/>
           </w:tcPr>
           <w:p>
             <w:r/>
@@ -1560,7 +1568,7 @@
         </w:tc>
         <w:tc>
           <w:tcPr>
-            <w:tcW w:type="dxa" w:w="3249"/>
+            <w:tcW w:type="dxa" w:w="5121"/>
           </w:tcPr>
           <w:p>
             <w:r/>
@@ -1578,7 +1586,7 @@
       <w:tr>
         <w:tc>
           <w:tcPr>
-            <w:tcW w:type="dxa" w:w="3249"/>
+            <w:tcW w:type="dxa" w:w="1522"/>
             <w:shd w:val="clear" w:color="auto" w:fill="F8F9FB"/>
           </w:tcPr>
           <w:p>
@@ -1595,7 +1603,7 @@
         </w:tc>
         <w:tc>
           <w:tcPr>
-            <w:tcW w:type="dxa" w:w="3249"/>
+            <w:tcW w:type="dxa" w:w="2768"/>
             <w:shd w:val="clear" w:color="auto" w:fill="F8F9FB"/>
           </w:tcPr>
           <w:p>
@@ -1612,7 +1620,7 @@
         </w:tc>
         <w:tc>
           <w:tcPr>
-            <w:tcW w:type="dxa" w:w="3249"/>
+            <w:tcW w:type="dxa" w:w="5121"/>
             <w:shd w:val="clear" w:color="auto" w:fill="F8F9FB"/>
           </w:tcPr>
           <w:p>
@@ -1631,7 +1639,7 @@
       <w:tr>
         <w:tc>
           <w:tcPr>
-            <w:tcW w:type="dxa" w:w="3249"/>
+            <w:tcW w:type="dxa" w:w="1522"/>
           </w:tcPr>
           <w:p>
             <w:r/>
@@ -1647,7 +1655,7 @@
         </w:tc>
         <w:tc>
           <w:tcPr>
-            <w:tcW w:type="dxa" w:w="3249"/>
+            <w:tcW w:type="dxa" w:w="2768"/>
           </w:tcPr>
           <w:p>
             <w:r/>
@@ -1663,7 +1671,7 @@
         </w:tc>
         <w:tc>
           <w:tcPr>
-            <w:tcW w:type="dxa" w:w="3249"/>
+            <w:tcW w:type="dxa" w:w="5121"/>
           </w:tcPr>
           <w:p>
             <w:r/>
@@ -1890,17 +1898,19 @@
         <w:tblStyle w:val="TableGrid"/>
         <w:tblW w:type="auto" w:w="0"/>
         <w:jc w:val="center"/>
+        <w:tblLayout w:type="fixed"/>
         <w:tblLook w:firstColumn="1" w:firstRow="1" w:lastColumn="0" w:lastRow="0" w:noHBand="0" w:noVBand="1" w:val="04A0"/>
+        <w:tblLayout w:type="fixed"/>
       </w:tblPr>
       <w:tblGrid>
-        <w:gridCol w:w="3249"/>
-        <w:gridCol w:w="3249"/>
-        <w:gridCol w:w="3249"/>
+        <w:gridCol w:w="1015"/>
+        <w:gridCol w:w="3967"/>
+        <w:gridCol w:w="4429"/>
       </w:tblGrid>
       <w:tr>
         <w:tc>
           <w:tcPr>
-            <w:tcW w:type="dxa" w:w="3249"/>
+            <w:tcW w:type="dxa" w:w="1015"/>
             <w:shd w:val="clear" w:color="auto" w:fill="2F3E5C"/>
           </w:tcPr>
           <w:p>
@@ -1917,7 +1927,7 @@
         </w:tc>
         <w:tc>
           <w:tcPr>
-            <w:tcW w:type="dxa" w:w="3249"/>
+            <w:tcW w:type="dxa" w:w="3967"/>
             <w:shd w:val="clear" w:color="auto" w:fill="2F3E5C"/>
           </w:tcPr>
           <w:p>
@@ -1935,7 +1945,7 @@
         </w:tc>
         <w:tc>
           <w:tcPr>
-            <w:tcW w:type="dxa" w:w="3249"/>
+            <w:tcW w:type="dxa" w:w="4429"/>
             <w:shd w:val="clear" w:color="auto" w:fill="2F3E5C"/>
           </w:tcPr>
           <w:p>
@@ -1955,7 +1965,7 @@
       <w:tr>
         <w:tc>
           <w:tcPr>
-            <w:tcW w:type="dxa" w:w="3249"/>
+            <w:tcW w:type="dxa" w:w="1015"/>
           </w:tcPr>
           <w:p>
             <w:r/>
@@ -1971,7 +1981,7 @@
         </w:tc>
         <w:tc>
           <w:tcPr>
-            <w:tcW w:type="dxa" w:w="3249"/>
+            <w:tcW w:type="dxa" w:w="3967"/>
           </w:tcPr>
           <w:p>
             <w:r/>
@@ -1987,7 +1997,7 @@
         </w:tc>
         <w:tc>
           <w:tcPr>
-            <w:tcW w:type="dxa" w:w="3249"/>
+            <w:tcW w:type="dxa" w:w="4429"/>
           </w:tcPr>
           <w:p>
             <w:r/>
@@ -2005,7 +2015,7 @@
       <w:tr>
         <w:tc>
           <w:tcPr>
-            <w:tcW w:type="dxa" w:w="3249"/>
+            <w:tcW w:type="dxa" w:w="1015"/>
             <w:shd w:val="clear" w:color="auto" w:fill="F8F9FB"/>
           </w:tcPr>
           <w:p>
@@ -2022,7 +2032,7 @@
         </w:tc>
         <w:tc>
           <w:tcPr>
-            <w:tcW w:type="dxa" w:w="3249"/>
+            <w:tcW w:type="dxa" w:w="3967"/>
             <w:shd w:val="clear" w:color="auto" w:fill="F8F9FB"/>
           </w:tcPr>
           <w:p>
@@ -2039,7 +2049,7 @@
         </w:tc>
         <w:tc>
           <w:tcPr>
-            <w:tcW w:type="dxa" w:w="3249"/>
+            <w:tcW w:type="dxa" w:w="4429"/>
             <w:shd w:val="clear" w:color="auto" w:fill="F8F9FB"/>
           </w:tcPr>
           <w:p>
@@ -2058,7 +2068,7 @@
       <w:tr>
         <w:tc>
           <w:tcPr>
-            <w:tcW w:type="dxa" w:w="3249"/>
+            <w:tcW w:type="dxa" w:w="1015"/>
           </w:tcPr>
           <w:p>
             <w:r/>
@@ -2074,7 +2084,7 @@
         </w:tc>
         <w:tc>
           <w:tcPr>
-            <w:tcW w:type="dxa" w:w="3249"/>
+            <w:tcW w:type="dxa" w:w="3967"/>
           </w:tcPr>
           <w:p>
             <w:r/>
@@ -2090,7 +2100,7 @@
         </w:tc>
         <w:tc>
           <w:tcPr>
-            <w:tcW w:type="dxa" w:w="3249"/>
+            <w:tcW w:type="dxa" w:w="4429"/>
           </w:tcPr>
           <w:p>
             <w:r/>
@@ -2108,7 +2118,7 @@
       <w:tr>
         <w:tc>
           <w:tcPr>
-            <w:tcW w:type="dxa" w:w="3249"/>
+            <w:tcW w:type="dxa" w:w="1015"/>
             <w:shd w:val="clear" w:color="auto" w:fill="F8F9FB"/>
           </w:tcPr>
           <w:p>
@@ -2125,7 +2135,7 @@
         </w:tc>
         <w:tc>
           <w:tcPr>
-            <w:tcW w:type="dxa" w:w="3249"/>
+            <w:tcW w:type="dxa" w:w="3967"/>
             <w:shd w:val="clear" w:color="auto" w:fill="F8F9FB"/>
           </w:tcPr>
           <w:p>
@@ -2142,7 +2152,7 @@
         </w:tc>
         <w:tc>
           <w:tcPr>
-            <w:tcW w:type="dxa" w:w="3249"/>
+            <w:tcW w:type="dxa" w:w="4429"/>
             <w:shd w:val="clear" w:color="auto" w:fill="F8F9FB"/>
           </w:tcPr>
           <w:p>
@@ -2161,7 +2171,7 @@
       <w:tr>
         <w:tc>
           <w:tcPr>
-            <w:tcW w:type="dxa" w:w="3249"/>
+            <w:tcW w:type="dxa" w:w="1015"/>
           </w:tcPr>
           <w:p>
             <w:r/>
@@ -2177,7 +2187,7 @@
         </w:tc>
         <w:tc>
           <w:tcPr>
-            <w:tcW w:type="dxa" w:w="3249"/>
+            <w:tcW w:type="dxa" w:w="3967"/>
           </w:tcPr>
           <w:p>
             <w:r/>
@@ -2193,7 +2203,7 @@
         </w:tc>
         <w:tc>
           <w:tcPr>
-            <w:tcW w:type="dxa" w:w="3249"/>
+            <w:tcW w:type="dxa" w:w="4429"/>
           </w:tcPr>
           <w:p>
             <w:r/>
@@ -2253,17 +2263,19 @@
         <w:tblStyle w:val="TableGrid"/>
         <w:tblW w:type="auto" w:w="0"/>
         <w:jc w:val="center"/>
+        <w:tblLayout w:type="fixed"/>
         <w:tblLook w:firstColumn="1" w:firstRow="1" w:lastColumn="0" w:lastRow="0" w:noHBand="0" w:noVBand="1" w:val="04A0"/>
+        <w:tblLayout w:type="fixed"/>
       </w:tblPr>
       <w:tblGrid>
-        <w:gridCol w:w="3249"/>
-        <w:gridCol w:w="3249"/>
-        <w:gridCol w:w="3249"/>
+        <w:gridCol w:w="1468"/>
+        <w:gridCol w:w="5180"/>
+        <w:gridCol w:w="2763"/>
       </w:tblGrid>
       <w:tr>
         <w:tc>
           <w:tcPr>
-            <w:tcW w:type="dxa" w:w="3249"/>
+            <w:tcW w:type="dxa" w:w="1468"/>
             <w:shd w:val="clear" w:color="auto" w:fill="2F3E5C"/>
           </w:tcPr>
           <w:p>
@@ -2281,7 +2293,7 @@
         </w:tc>
         <w:tc>
           <w:tcPr>
-            <w:tcW w:type="dxa" w:w="3249"/>
+            <w:tcW w:type="dxa" w:w="5180"/>
             <w:shd w:val="clear" w:color="auto" w:fill="2F3E5C"/>
           </w:tcPr>
           <w:p>
@@ -2299,7 +2311,7 @@
         </w:tc>
         <w:tc>
           <w:tcPr>
-            <w:tcW w:type="dxa" w:w="3249"/>
+            <w:tcW w:type="dxa" w:w="2763"/>
             <w:shd w:val="clear" w:color="auto" w:fill="2F3E5C"/>
           </w:tcPr>
           <w:p>
@@ -2319,7 +2331,7 @@
       <w:tr>
         <w:tc>
           <w:tcPr>
-            <w:tcW w:type="dxa" w:w="3249"/>
+            <w:tcW w:type="dxa" w:w="1468"/>
           </w:tcPr>
           <w:p>
             <w:r/>
@@ -2335,7 +2347,7 @@
         </w:tc>
         <w:tc>
           <w:tcPr>
-            <w:tcW w:type="dxa" w:w="3249"/>
+            <w:tcW w:type="dxa" w:w="5180"/>
           </w:tcPr>
           <w:p>
             <w:r/>
@@ -2351,7 +2363,7 @@
         </w:tc>
         <w:tc>
           <w:tcPr>
-            <w:tcW w:type="dxa" w:w="3249"/>
+            <w:tcW w:type="dxa" w:w="2763"/>
           </w:tcPr>
           <w:p>
             <w:r/>
@@ -2369,7 +2381,7 @@
       <w:tr>
         <w:tc>
           <w:tcPr>
-            <w:tcW w:type="dxa" w:w="3249"/>
+            <w:tcW w:type="dxa" w:w="1468"/>
             <w:shd w:val="clear" w:color="auto" w:fill="F8F9FB"/>
           </w:tcPr>
           <w:p>
@@ -2386,7 +2398,7 @@
         </w:tc>
         <w:tc>
           <w:tcPr>
-            <w:tcW w:type="dxa" w:w="3249"/>
+            <w:tcW w:type="dxa" w:w="5180"/>
             <w:shd w:val="clear" w:color="auto" w:fill="F8F9FB"/>
           </w:tcPr>
           <w:p>
@@ -2403,7 +2415,7 @@
         </w:tc>
         <w:tc>
           <w:tcPr>
-            <w:tcW w:type="dxa" w:w="3249"/>
+            <w:tcW w:type="dxa" w:w="2763"/>
             <w:shd w:val="clear" w:color="auto" w:fill="F8F9FB"/>
           </w:tcPr>
           <w:p>
@@ -2422,7 +2434,7 @@
       <w:tr>
         <w:tc>
           <w:tcPr>
-            <w:tcW w:type="dxa" w:w="3249"/>
+            <w:tcW w:type="dxa" w:w="1468"/>
           </w:tcPr>
           <w:p>
             <w:r/>
@@ -2438,7 +2450,7 @@
         </w:tc>
         <w:tc>
           <w:tcPr>
-            <w:tcW w:type="dxa" w:w="3249"/>
+            <w:tcW w:type="dxa" w:w="5180"/>
           </w:tcPr>
           <w:p>
             <w:r/>
@@ -2454,7 +2466,7 @@
         </w:tc>
         <w:tc>
           <w:tcPr>
-            <w:tcW w:type="dxa" w:w="3249"/>
+            <w:tcW w:type="dxa" w:w="2763"/>
           </w:tcPr>
           <w:p>
             <w:r/>
@@ -2472,7 +2484,7 @@
       <w:tr>
         <w:tc>
           <w:tcPr>
-            <w:tcW w:type="dxa" w:w="3249"/>
+            <w:tcW w:type="dxa" w:w="1468"/>
             <w:shd w:val="clear" w:color="auto" w:fill="F8F9FB"/>
           </w:tcPr>
           <w:p>
@@ -2489,7 +2501,7 @@
         </w:tc>
         <w:tc>
           <w:tcPr>
-            <w:tcW w:type="dxa" w:w="3249"/>
+            <w:tcW w:type="dxa" w:w="5180"/>
             <w:shd w:val="clear" w:color="auto" w:fill="F8F9FB"/>
           </w:tcPr>
           <w:p>
@@ -2506,7 +2518,7 @@
         </w:tc>
         <w:tc>
           <w:tcPr>
-            <w:tcW w:type="dxa" w:w="3249"/>
+            <w:tcW w:type="dxa" w:w="2763"/>
             <w:shd w:val="clear" w:color="auto" w:fill="F8F9FB"/>
           </w:tcPr>
           <w:p>
@@ -2541,16 +2553,18 @@
         <w:tblStyle w:val="TableGrid"/>
         <w:tblW w:type="auto" w:w="0"/>
         <w:jc w:val="center"/>
+        <w:tblLayout w:type="fixed"/>
         <w:tblLook w:firstColumn="1" w:firstRow="1" w:lastColumn="0" w:lastRow="0" w:noHBand="0" w:noVBand="1" w:val="04A0"/>
+        <w:tblLayout w:type="fixed"/>
       </w:tblPr>
       <w:tblGrid>
-        <w:gridCol w:w="4873"/>
-        <w:gridCol w:w="4873"/>
+        <w:gridCol w:w="1908"/>
+        <w:gridCol w:w="7503"/>
       </w:tblGrid>
       <w:tr>
         <w:tc>
           <w:tcPr>
-            <w:tcW w:type="dxa" w:w="4873"/>
+            <w:tcW w:type="dxa" w:w="1908"/>
             <w:shd w:val="clear" w:color="auto" w:fill="2F3E5C"/>
           </w:tcPr>
           <w:p>
@@ -2568,7 +2582,7 @@
         </w:tc>
         <w:tc>
           <w:tcPr>
-            <w:tcW w:type="dxa" w:w="4873"/>
+            <w:tcW w:type="dxa" w:w="7503"/>
             <w:shd w:val="clear" w:color="auto" w:fill="2F3E5C"/>
           </w:tcPr>
           <w:p>
@@ -2588,7 +2602,7 @@
       <w:tr>
         <w:tc>
           <w:tcPr>
-            <w:tcW w:type="dxa" w:w="4873"/>
+            <w:tcW w:type="dxa" w:w="1908"/>
           </w:tcPr>
           <w:p>
             <w:r/>
@@ -2604,7 +2618,7 @@
         </w:tc>
         <w:tc>
           <w:tcPr>
-            <w:tcW w:type="dxa" w:w="4873"/>
+            <w:tcW w:type="dxa" w:w="7503"/>
           </w:tcPr>
           <w:p>
             <w:r/>
@@ -2622,7 +2636,7 @@
       <w:tr>
         <w:tc>
           <w:tcPr>
-            <w:tcW w:type="dxa" w:w="4873"/>
+            <w:tcW w:type="dxa" w:w="1908"/>
             <w:shd w:val="clear" w:color="auto" w:fill="F8F9FB"/>
           </w:tcPr>
           <w:p>
@@ -2639,7 +2653,7 @@
         </w:tc>
         <w:tc>
           <w:tcPr>
-            <w:tcW w:type="dxa" w:w="4873"/>
+            <w:tcW w:type="dxa" w:w="7503"/>
             <w:shd w:val="clear" w:color="auto" w:fill="F8F9FB"/>
           </w:tcPr>
           <w:p>
@@ -2658,7 +2672,7 @@
       <w:tr>
         <w:tc>
           <w:tcPr>
-            <w:tcW w:type="dxa" w:w="4873"/>
+            <w:tcW w:type="dxa" w:w="1908"/>
           </w:tcPr>
           <w:p>
             <w:r/>
@@ -2674,7 +2688,7 @@
         </w:tc>
         <w:tc>
           <w:tcPr>
-            <w:tcW w:type="dxa" w:w="4873"/>
+            <w:tcW w:type="dxa" w:w="7503"/>
           </w:tcPr>
           <w:p>
             <w:r/>
@@ -2692,7 +2706,7 @@
       <w:tr>
         <w:tc>
           <w:tcPr>
-            <w:tcW w:type="dxa" w:w="4873"/>
+            <w:tcW w:type="dxa" w:w="1908"/>
             <w:shd w:val="clear" w:color="auto" w:fill="F8F9FB"/>
           </w:tcPr>
           <w:p>
@@ -2709,7 +2723,7 @@
         </w:tc>
         <w:tc>
           <w:tcPr>
-            <w:tcW w:type="dxa" w:w="4873"/>
+            <w:tcW w:type="dxa" w:w="7503"/>
             <w:shd w:val="clear" w:color="auto" w:fill="F8F9FB"/>
           </w:tcPr>
           <w:p>
@@ -2728,7 +2742,7 @@
       <w:tr>
         <w:tc>
           <w:tcPr>
-            <w:tcW w:type="dxa" w:w="4873"/>
+            <w:tcW w:type="dxa" w:w="1908"/>
           </w:tcPr>
           <w:p>
             <w:r/>
@@ -2744,7 +2758,7 @@
         </w:tc>
         <w:tc>
           <w:tcPr>
-            <w:tcW w:type="dxa" w:w="4873"/>
+            <w:tcW w:type="dxa" w:w="7503"/>
           </w:tcPr>
           <w:p>
             <w:r/>
@@ -2762,7 +2776,7 @@
       <w:tr>
         <w:tc>
           <w:tcPr>
-            <w:tcW w:type="dxa" w:w="4873"/>
+            <w:tcW w:type="dxa" w:w="1908"/>
             <w:shd w:val="clear" w:color="auto" w:fill="F8F9FB"/>
           </w:tcPr>
           <w:p>
@@ -2779,7 +2793,7 @@
         </w:tc>
         <w:tc>
           <w:tcPr>
-            <w:tcW w:type="dxa" w:w="4873"/>
+            <w:tcW w:type="dxa" w:w="7503"/>
             <w:shd w:val="clear" w:color="auto" w:fill="F8F9FB"/>
           </w:tcPr>
           <w:p>
@@ -3130,17 +3144,19 @@
         <w:tblStyle w:val="TableGrid"/>
         <w:tblW w:type="auto" w:w="0"/>
         <w:jc w:val="center"/>
+        <w:tblLayout w:type="fixed"/>
         <w:tblLook w:firstColumn="1" w:firstRow="1" w:lastColumn="0" w:lastRow="0" w:noHBand="0" w:noVBand="1" w:val="04A0"/>
+        <w:tblLayout w:type="fixed"/>
       </w:tblPr>
       <w:tblGrid>
-        <w:gridCol w:w="3249"/>
-        <w:gridCol w:w="3249"/>
-        <w:gridCol w:w="3249"/>
+        <w:gridCol w:w="1262"/>
+        <w:gridCol w:w="5738"/>
+        <w:gridCol w:w="2410"/>
       </w:tblGrid>
       <w:tr>
         <w:tc>
           <w:tcPr>
-            <w:tcW w:type="dxa" w:w="3249"/>
+            <w:tcW w:type="dxa" w:w="1262"/>
             <w:shd w:val="clear" w:color="auto" w:fill="2F3E5C"/>
           </w:tcPr>
           <w:p>
@@ -3158,7 +3174,7 @@
         </w:tc>
         <w:tc>
           <w:tcPr>
-            <w:tcW w:type="dxa" w:w="3249"/>
+            <w:tcW w:type="dxa" w:w="5738"/>
             <w:shd w:val="clear" w:color="auto" w:fill="2F3E5C"/>
           </w:tcPr>
           <w:p>
@@ -3176,7 +3192,7 @@
         </w:tc>
         <w:tc>
           <w:tcPr>
-            <w:tcW w:type="dxa" w:w="3249"/>
+            <w:tcW w:type="dxa" w:w="2410"/>
             <w:shd w:val="clear" w:color="auto" w:fill="2F3E5C"/>
           </w:tcPr>
           <w:p>
@@ -3196,7 +3212,7 @@
       <w:tr>
         <w:tc>
           <w:tcPr>
-            <w:tcW w:type="dxa" w:w="3249"/>
+            <w:tcW w:type="dxa" w:w="1262"/>
           </w:tcPr>
           <w:p>
             <w:r/>
@@ -3212,7 +3228,7 @@
         </w:tc>
         <w:tc>
           <w:tcPr>
-            <w:tcW w:type="dxa" w:w="3249"/>
+            <w:tcW w:type="dxa" w:w="5738"/>
           </w:tcPr>
           <w:p>
             <w:r/>
@@ -3228,7 +3244,7 @@
         </w:tc>
         <w:tc>
           <w:tcPr>
-            <w:tcW w:type="dxa" w:w="3249"/>
+            <w:tcW w:type="dxa" w:w="2410"/>
           </w:tcPr>
           <w:p>
             <w:r/>
@@ -3246,7 +3262,7 @@
       <w:tr>
         <w:tc>
           <w:tcPr>
-            <w:tcW w:type="dxa" w:w="3249"/>
+            <w:tcW w:type="dxa" w:w="1262"/>
             <w:shd w:val="clear" w:color="auto" w:fill="F8F9FB"/>
           </w:tcPr>
           <w:p>
@@ -3263,7 +3279,7 @@
         </w:tc>
         <w:tc>
           <w:tcPr>
-            <w:tcW w:type="dxa" w:w="3249"/>
+            <w:tcW w:type="dxa" w:w="5738"/>
             <w:shd w:val="clear" w:color="auto" w:fill="F8F9FB"/>
           </w:tcPr>
           <w:p>
@@ -3280,7 +3296,7 @@
         </w:tc>
         <w:tc>
           <w:tcPr>
-            <w:tcW w:type="dxa" w:w="3249"/>
+            <w:tcW w:type="dxa" w:w="2410"/>
             <w:shd w:val="clear" w:color="auto" w:fill="F8F9FB"/>
           </w:tcPr>
           <w:p>
@@ -3299,7 +3315,7 @@
       <w:tr>
         <w:tc>
           <w:tcPr>
-            <w:tcW w:type="dxa" w:w="3249"/>
+            <w:tcW w:type="dxa" w:w="1262"/>
           </w:tcPr>
           <w:p>
             <w:r/>
@@ -3315,7 +3331,7 @@
         </w:tc>
         <w:tc>
           <w:tcPr>
-            <w:tcW w:type="dxa" w:w="3249"/>
+            <w:tcW w:type="dxa" w:w="5738"/>
           </w:tcPr>
           <w:p>
             <w:r/>
@@ -3331,7 +3347,7 @@
         </w:tc>
         <w:tc>
           <w:tcPr>
-            <w:tcW w:type="dxa" w:w="3249"/>
+            <w:tcW w:type="dxa" w:w="2410"/>
           </w:tcPr>
           <w:p>
             <w:r/>
@@ -3349,7 +3365,7 @@
       <w:tr>
         <w:tc>
           <w:tcPr>
-            <w:tcW w:type="dxa" w:w="3249"/>
+            <w:tcW w:type="dxa" w:w="1262"/>
             <w:shd w:val="clear" w:color="auto" w:fill="F8F9FB"/>
           </w:tcPr>
           <w:p>
@@ -3366,7 +3382,7 @@
         </w:tc>
         <w:tc>
           <w:tcPr>
-            <w:tcW w:type="dxa" w:w="3249"/>
+            <w:tcW w:type="dxa" w:w="5738"/>
             <w:shd w:val="clear" w:color="auto" w:fill="F8F9FB"/>
           </w:tcPr>
           <w:p>
@@ -3383,7 +3399,7 @@
         </w:tc>
         <w:tc>
           <w:tcPr>
-            <w:tcW w:type="dxa" w:w="3249"/>
+            <w:tcW w:type="dxa" w:w="2410"/>
             <w:shd w:val="clear" w:color="auto" w:fill="F8F9FB"/>
           </w:tcPr>
           <w:p>
@@ -3402,7 +3418,7 @@
       <w:tr>
         <w:tc>
           <w:tcPr>
-            <w:tcW w:type="dxa" w:w="3249"/>
+            <w:tcW w:type="dxa" w:w="1262"/>
           </w:tcPr>
           <w:p>
             <w:r/>
@@ -3418,7 +3434,7 @@
         </w:tc>
         <w:tc>
           <w:tcPr>
-            <w:tcW w:type="dxa" w:w="3249"/>
+            <w:tcW w:type="dxa" w:w="5738"/>
           </w:tcPr>
           <w:p>
             <w:r/>
@@ -3434,7 +3450,7 @@
         </w:tc>
         <w:tc>
           <w:tcPr>
-            <w:tcW w:type="dxa" w:w="3249"/>
+            <w:tcW w:type="dxa" w:w="2410"/>
           </w:tcPr>
           <w:p>
             <w:r/>
@@ -3452,7 +3468,7 @@
       <w:tr>
         <w:tc>
           <w:tcPr>
-            <w:tcW w:type="dxa" w:w="3249"/>
+            <w:tcW w:type="dxa" w:w="1262"/>
             <w:shd w:val="clear" w:color="auto" w:fill="F8F9FB"/>
           </w:tcPr>
           <w:p>
@@ -3469,7 +3485,7 @@
         </w:tc>
         <w:tc>
           <w:tcPr>
-            <w:tcW w:type="dxa" w:w="3249"/>
+            <w:tcW w:type="dxa" w:w="5738"/>
             <w:shd w:val="clear" w:color="auto" w:fill="F8F9FB"/>
           </w:tcPr>
           <w:p>
@@ -3486,7 +3502,7 @@
         </w:tc>
         <w:tc>
           <w:tcPr>
-            <w:tcW w:type="dxa" w:w="3249"/>
+            <w:tcW w:type="dxa" w:w="2410"/>
             <w:shd w:val="clear" w:color="auto" w:fill="F8F9FB"/>
           </w:tcPr>
           <w:p>
@@ -3922,17 +3938,19 @@
         <w:tblStyle w:val="TableGrid"/>
         <w:tblW w:type="auto" w:w="0"/>
         <w:jc w:val="center"/>
+        <w:tblLayout w:type="fixed"/>
         <w:tblLook w:firstColumn="1" w:firstRow="1" w:lastColumn="0" w:lastRow="0" w:noHBand="0" w:noVBand="1" w:val="04A0"/>
+        <w:tblLayout w:type="fixed"/>
       </w:tblPr>
       <w:tblGrid>
-        <w:gridCol w:w="3249"/>
-        <w:gridCol w:w="3249"/>
-        <w:gridCol w:w="3249"/>
+        <w:gridCol w:w="1232"/>
+        <w:gridCol w:w="2689"/>
+        <w:gridCol w:w="5490"/>
       </w:tblGrid>
       <w:tr>
         <w:tc>
           <w:tcPr>
-            <w:tcW w:type="dxa" w:w="3249"/>
+            <w:tcW w:type="dxa" w:w="1232"/>
             <w:shd w:val="clear" w:color="auto" w:fill="2F3E5C"/>
           </w:tcPr>
           <w:p>
@@ -3950,7 +3968,7 @@
         </w:tc>
         <w:tc>
           <w:tcPr>
-            <w:tcW w:type="dxa" w:w="3249"/>
+            <w:tcW w:type="dxa" w:w="2689"/>
             <w:shd w:val="clear" w:color="auto" w:fill="2F3E5C"/>
           </w:tcPr>
           <w:p>
@@ -3968,7 +3986,7 @@
         </w:tc>
         <w:tc>
           <w:tcPr>
-            <w:tcW w:type="dxa" w:w="3249"/>
+            <w:tcW w:type="dxa" w:w="5490"/>
             <w:shd w:val="clear" w:color="auto" w:fill="2F3E5C"/>
           </w:tcPr>
           <w:p>
@@ -3988,7 +4006,7 @@
       <w:tr>
         <w:tc>
           <w:tcPr>
-            <w:tcW w:type="dxa" w:w="3249"/>
+            <w:tcW w:type="dxa" w:w="1232"/>
           </w:tcPr>
           <w:p>
             <w:r/>
@@ -4004,7 +4022,7 @@
         </w:tc>
         <w:tc>
           <w:tcPr>
-            <w:tcW w:type="dxa" w:w="3249"/>
+            <w:tcW w:type="dxa" w:w="2689"/>
           </w:tcPr>
           <w:p>
             <w:r/>
@@ -4020,7 +4038,7 @@
         </w:tc>
         <w:tc>
           <w:tcPr>
-            <w:tcW w:type="dxa" w:w="3249"/>
+            <w:tcW w:type="dxa" w:w="5490"/>
           </w:tcPr>
           <w:p>
             <w:r/>
@@ -4038,7 +4056,7 @@
       <w:tr>
         <w:tc>
           <w:tcPr>
-            <w:tcW w:type="dxa" w:w="3249"/>
+            <w:tcW w:type="dxa" w:w="1232"/>
             <w:shd w:val="clear" w:color="auto" w:fill="F8F9FB"/>
           </w:tcPr>
           <w:p>
@@ -4055,7 +4073,7 @@
         </w:tc>
         <w:tc>
           <w:tcPr>
-            <w:tcW w:type="dxa" w:w="3249"/>
+            <w:tcW w:type="dxa" w:w="2689"/>
             <w:shd w:val="clear" w:color="auto" w:fill="F8F9FB"/>
           </w:tcPr>
           <w:p>
@@ -4072,7 +4090,7 @@
         </w:tc>
         <w:tc>
           <w:tcPr>
-            <w:tcW w:type="dxa" w:w="3249"/>
+            <w:tcW w:type="dxa" w:w="5490"/>
             <w:shd w:val="clear" w:color="auto" w:fill="F8F9FB"/>
           </w:tcPr>
           <w:p>
@@ -4091,7 +4109,7 @@
       <w:tr>
         <w:tc>
           <w:tcPr>
-            <w:tcW w:type="dxa" w:w="3249"/>
+            <w:tcW w:type="dxa" w:w="1232"/>
           </w:tcPr>
           <w:p>
             <w:r/>
@@ -4107,7 +4125,7 @@
         </w:tc>
         <w:tc>
           <w:tcPr>
-            <w:tcW w:type="dxa" w:w="3249"/>
+            <w:tcW w:type="dxa" w:w="2689"/>
           </w:tcPr>
           <w:p>
             <w:r/>
@@ -4123,7 +4141,7 @@
         </w:tc>
         <w:tc>
           <w:tcPr>
-            <w:tcW w:type="dxa" w:w="3249"/>
+            <w:tcW w:type="dxa" w:w="5490"/>
           </w:tcPr>
           <w:p>
             <w:r/>
@@ -4141,7 +4159,7 @@
       <w:tr>
         <w:tc>
           <w:tcPr>
-            <w:tcW w:type="dxa" w:w="3249"/>
+            <w:tcW w:type="dxa" w:w="1232"/>
             <w:shd w:val="clear" w:color="auto" w:fill="F8F9FB"/>
           </w:tcPr>
           <w:p>
@@ -4158,7 +4176,7 @@
         </w:tc>
         <w:tc>
           <w:tcPr>
-            <w:tcW w:type="dxa" w:w="3249"/>
+            <w:tcW w:type="dxa" w:w="2689"/>
             <w:shd w:val="clear" w:color="auto" w:fill="F8F9FB"/>
           </w:tcPr>
           <w:p>
@@ -4175,7 +4193,7 @@
         </w:tc>
         <w:tc>
           <w:tcPr>
-            <w:tcW w:type="dxa" w:w="3249"/>
+            <w:tcW w:type="dxa" w:w="5490"/>
             <w:shd w:val="clear" w:color="auto" w:fill="F8F9FB"/>
           </w:tcPr>
           <w:p>
@@ -4356,19 +4374,21 @@
         <w:tblStyle w:val="TableGrid"/>
         <w:tblW w:type="auto" w:w="0"/>
         <w:jc w:val="center"/>
+        <w:tblLayout w:type="fixed"/>
         <w:tblLook w:firstColumn="1" w:firstRow="1" w:lastColumn="0" w:lastRow="0" w:noHBand="0" w:noVBand="1" w:val="04A0"/>
+        <w:tblLayout w:type="fixed"/>
       </w:tblPr>
       <w:tblGrid>
-        <w:gridCol w:w="1949"/>
-        <w:gridCol w:w="1949"/>
-        <w:gridCol w:w="1949"/>
-        <w:gridCol w:w="1949"/>
-        <w:gridCol w:w="1949"/>
+        <w:gridCol w:w="631"/>
+        <w:gridCol w:w="3386"/>
+        <w:gridCol w:w="1894"/>
+        <w:gridCol w:w="2869"/>
+        <w:gridCol w:w="631"/>
       </w:tblGrid>
       <w:tr>
         <w:tc>
           <w:tcPr>
-            <w:tcW w:type="dxa" w:w="1949"/>
+            <w:tcW w:type="dxa" w:w="631"/>
             <w:shd w:val="clear" w:color="auto" w:fill="2F3E5C"/>
           </w:tcPr>
           <w:p>
@@ -4386,7 +4406,7 @@
         </w:tc>
         <w:tc>
           <w:tcPr>
-            <w:tcW w:type="dxa" w:w="1949"/>
+            <w:tcW w:type="dxa" w:w="3386"/>
             <w:shd w:val="clear" w:color="auto" w:fill="2F3E5C"/>
           </w:tcPr>
           <w:p>
@@ -4404,7 +4424,7 @@
         </w:tc>
         <w:tc>
           <w:tcPr>
-            <w:tcW w:type="dxa" w:w="1949"/>
+            <w:tcW w:type="dxa" w:w="1894"/>
             <w:shd w:val="clear" w:color="auto" w:fill="2F3E5C"/>
           </w:tcPr>
           <w:p>
@@ -4422,7 +4442,7 @@
         </w:tc>
         <w:tc>
           <w:tcPr>
-            <w:tcW w:type="dxa" w:w="1949"/>
+            <w:tcW w:type="dxa" w:w="2869"/>
             <w:shd w:val="clear" w:color="auto" w:fill="2F3E5C"/>
           </w:tcPr>
           <w:p>
@@ -4440,7 +4460,7 @@
         </w:tc>
         <w:tc>
           <w:tcPr>
-            <w:tcW w:type="dxa" w:w="1949"/>
+            <w:tcW w:type="dxa" w:w="631"/>
             <w:shd w:val="clear" w:color="auto" w:fill="2F3E5C"/>
           </w:tcPr>
           <w:p>
@@ -4460,7 +4480,7 @@
       <w:tr>
         <w:tc>
           <w:tcPr>
-            <w:tcW w:type="dxa" w:w="1949"/>
+            <w:tcW w:type="dxa" w:w="631"/>
           </w:tcPr>
           <w:p>
             <w:r/>
@@ -4476,7 +4496,7 @@
         </w:tc>
         <w:tc>
           <w:tcPr>
-            <w:tcW w:type="dxa" w:w="1949"/>
+            <w:tcW w:type="dxa" w:w="3386"/>
           </w:tcPr>
           <w:p>
             <w:r/>
@@ -4492,7 +4512,7 @@
         </w:tc>
         <w:tc>
           <w:tcPr>
-            <w:tcW w:type="dxa" w:w="1949"/>
+            <w:tcW w:type="dxa" w:w="1894"/>
           </w:tcPr>
           <w:p>
             <w:r/>
@@ -4508,7 +4528,7 @@
         </w:tc>
         <w:tc>
           <w:tcPr>
-            <w:tcW w:type="dxa" w:w="1949"/>
+            <w:tcW w:type="dxa" w:w="2869"/>
           </w:tcPr>
           <w:p>
             <w:r/>
@@ -4524,7 +4544,7 @@
         </w:tc>
         <w:tc>
           <w:tcPr>
-            <w:tcW w:type="dxa" w:w="1949"/>
+            <w:tcW w:type="dxa" w:w="631"/>
           </w:tcPr>
           <w:p>
             <w:r/>
@@ -4542,7 +4562,7 @@
       <w:tr>
         <w:tc>
           <w:tcPr>
-            <w:tcW w:type="dxa" w:w="1949"/>
+            <w:tcW w:type="dxa" w:w="631"/>
             <w:shd w:val="clear" w:color="auto" w:fill="F8F9FB"/>
           </w:tcPr>
           <w:p>
@@ -4559,7 +4579,7 @@
         </w:tc>
         <w:tc>
           <w:tcPr>
-            <w:tcW w:type="dxa" w:w="1949"/>
+            <w:tcW w:type="dxa" w:w="3386"/>
             <w:shd w:val="clear" w:color="auto" w:fill="F8F9FB"/>
           </w:tcPr>
           <w:p>
@@ -4576,7 +4596,7 @@
         </w:tc>
         <w:tc>
           <w:tcPr>
-            <w:tcW w:type="dxa" w:w="1949"/>
+            <w:tcW w:type="dxa" w:w="1894"/>
             <w:shd w:val="clear" w:color="auto" w:fill="F8F9FB"/>
           </w:tcPr>
           <w:p>
@@ -4593,7 +4613,7 @@
         </w:tc>
         <w:tc>
           <w:tcPr>
-            <w:tcW w:type="dxa" w:w="1949"/>
+            <w:tcW w:type="dxa" w:w="2869"/>
             <w:shd w:val="clear" w:color="auto" w:fill="F8F9FB"/>
           </w:tcPr>
           <w:p>
@@ -4610,7 +4630,7 @@
         </w:tc>
         <w:tc>
           <w:tcPr>
-            <w:tcW w:type="dxa" w:w="1949"/>
+            <w:tcW w:type="dxa" w:w="631"/>
             <w:shd w:val="clear" w:color="auto" w:fill="F8F9FB"/>
           </w:tcPr>
           <w:p>
@@ -4629,7 +4649,7 @@
       <w:tr>
         <w:tc>
           <w:tcPr>
-            <w:tcW w:type="dxa" w:w="1949"/>
+            <w:tcW w:type="dxa" w:w="631"/>
           </w:tcPr>
           <w:p>
             <w:r/>
@@ -4645,7 +4665,7 @@
         </w:tc>
         <w:tc>
           <w:tcPr>
-            <w:tcW w:type="dxa" w:w="1949"/>
+            <w:tcW w:type="dxa" w:w="3386"/>
           </w:tcPr>
           <w:p>
             <w:r/>
@@ -4661,7 +4681,7 @@
         </w:tc>
         <w:tc>
           <w:tcPr>
-            <w:tcW w:type="dxa" w:w="1949"/>
+            <w:tcW w:type="dxa" w:w="1894"/>
           </w:tcPr>
           <w:p>
             <w:r/>
@@ -4677,7 +4697,7 @@
         </w:tc>
         <w:tc>
           <w:tcPr>
-            <w:tcW w:type="dxa" w:w="1949"/>
+            <w:tcW w:type="dxa" w:w="2869"/>
           </w:tcPr>
           <w:p>
             <w:r/>
@@ -4693,7 +4713,7 @@
         </w:tc>
         <w:tc>
           <w:tcPr>
-            <w:tcW w:type="dxa" w:w="1949"/>
+            <w:tcW w:type="dxa" w:w="631"/>
           </w:tcPr>
           <w:p>
             <w:r/>
@@ -4711,7 +4731,7 @@
       <w:tr>
         <w:tc>
           <w:tcPr>
-            <w:tcW w:type="dxa" w:w="1949"/>
+            <w:tcW w:type="dxa" w:w="631"/>
             <w:shd w:val="clear" w:color="auto" w:fill="F8F9FB"/>
           </w:tcPr>
           <w:p>
@@ -4728,7 +4748,7 @@
         </w:tc>
         <w:tc>
           <w:tcPr>
-            <w:tcW w:type="dxa" w:w="1949"/>
+            <w:tcW w:type="dxa" w:w="3386"/>
             <w:shd w:val="clear" w:color="auto" w:fill="F8F9FB"/>
           </w:tcPr>
           <w:p>
@@ -4745,7 +4765,7 @@
         </w:tc>
         <w:tc>
           <w:tcPr>
-            <w:tcW w:type="dxa" w:w="1949"/>
+            <w:tcW w:type="dxa" w:w="1894"/>
             <w:shd w:val="clear" w:color="auto" w:fill="F8F9FB"/>
           </w:tcPr>
           <w:p>
@@ -4762,7 +4782,7 @@
         </w:tc>
         <w:tc>
           <w:tcPr>
-            <w:tcW w:type="dxa" w:w="1949"/>
+            <w:tcW w:type="dxa" w:w="2869"/>
             <w:shd w:val="clear" w:color="auto" w:fill="F8F9FB"/>
           </w:tcPr>
           <w:p>
@@ -4779,7 +4799,7 @@
         </w:tc>
         <w:tc>
           <w:tcPr>
-            <w:tcW w:type="dxa" w:w="1949"/>
+            <w:tcW w:type="dxa" w:w="631"/>
             <w:shd w:val="clear" w:color="auto" w:fill="F8F9FB"/>
           </w:tcPr>
           <w:p>
@@ -4798,7 +4818,7 @@
       <w:tr>
         <w:tc>
           <w:tcPr>
-            <w:tcW w:type="dxa" w:w="1949"/>
+            <w:tcW w:type="dxa" w:w="631"/>
           </w:tcPr>
           <w:p>
             <w:r/>
@@ -4814,7 +4834,7 @@
         </w:tc>
         <w:tc>
           <w:tcPr>
-            <w:tcW w:type="dxa" w:w="1949"/>
+            <w:tcW w:type="dxa" w:w="3386"/>
           </w:tcPr>
           <w:p>
             <w:r/>
@@ -4830,7 +4850,7 @@
         </w:tc>
         <w:tc>
           <w:tcPr>
-            <w:tcW w:type="dxa" w:w="1949"/>
+            <w:tcW w:type="dxa" w:w="1894"/>
           </w:tcPr>
           <w:p>
             <w:r/>
@@ -4846,7 +4866,7 @@
         </w:tc>
         <w:tc>
           <w:tcPr>
-            <w:tcW w:type="dxa" w:w="1949"/>
+            <w:tcW w:type="dxa" w:w="2869"/>
           </w:tcPr>
           <w:p>
             <w:r/>
@@ -4862,7 +4882,7 @@
         </w:tc>
         <w:tc>
           <w:tcPr>
-            <w:tcW w:type="dxa" w:w="1949"/>
+            <w:tcW w:type="dxa" w:w="631"/>
           </w:tcPr>
           <w:p>
             <w:r/>
@@ -5121,17 +5141,19 @@
         <w:tblStyle w:val="TableGrid"/>
         <w:tblW w:type="auto" w:w="0"/>
         <w:jc w:val="center"/>
+        <w:tblLayout w:type="fixed"/>
         <w:tblLook w:firstColumn="1" w:firstRow="1" w:lastColumn="0" w:lastRow="0" w:noHBand="0" w:noVBand="1" w:val="04A0"/>
+        <w:tblLayout w:type="fixed"/>
       </w:tblPr>
       <w:tblGrid>
-        <w:gridCol w:w="3249"/>
-        <w:gridCol w:w="3249"/>
-        <w:gridCol w:w="3249"/>
+        <w:gridCol w:w="1670"/>
+        <w:gridCol w:w="2884"/>
+        <w:gridCol w:w="4857"/>
       </w:tblGrid>
       <w:tr>
         <w:tc>
           <w:tcPr>
-            <w:tcW w:type="dxa" w:w="3249"/>
+            <w:tcW w:type="dxa" w:w="1670"/>
             <w:shd w:val="clear" w:color="auto" w:fill="2F3E5C"/>
           </w:tcPr>
           <w:p>
@@ -5148,7 +5170,7 @@
         </w:tc>
         <w:tc>
           <w:tcPr>
-            <w:tcW w:type="dxa" w:w="3249"/>
+            <w:tcW w:type="dxa" w:w="2884"/>
             <w:shd w:val="clear" w:color="auto" w:fill="2F3E5C"/>
           </w:tcPr>
           <w:p>
@@ -5166,7 +5188,7 @@
         </w:tc>
         <w:tc>
           <w:tcPr>
-            <w:tcW w:type="dxa" w:w="3249"/>
+            <w:tcW w:type="dxa" w:w="4857"/>
             <w:shd w:val="clear" w:color="auto" w:fill="2F3E5C"/>
           </w:tcPr>
           <w:p>
@@ -5186,7 +5208,7 @@
       <w:tr>
         <w:tc>
           <w:tcPr>
-            <w:tcW w:type="dxa" w:w="3249"/>
+            <w:tcW w:type="dxa" w:w="1670"/>
           </w:tcPr>
           <w:p>
             <w:r/>
@@ -5202,7 +5224,7 @@
         </w:tc>
         <w:tc>
           <w:tcPr>
-            <w:tcW w:type="dxa" w:w="3249"/>
+            <w:tcW w:type="dxa" w:w="2884"/>
           </w:tcPr>
           <w:p>
             <w:r/>
@@ -5218,7 +5240,7 @@
         </w:tc>
         <w:tc>
           <w:tcPr>
-            <w:tcW w:type="dxa" w:w="3249"/>
+            <w:tcW w:type="dxa" w:w="4857"/>
           </w:tcPr>
           <w:p>
             <w:r/>
@@ -5236,7 +5258,7 @@
       <w:tr>
         <w:tc>
           <w:tcPr>
-            <w:tcW w:type="dxa" w:w="3249"/>
+            <w:tcW w:type="dxa" w:w="1670"/>
             <w:shd w:val="clear" w:color="auto" w:fill="F8F9FB"/>
           </w:tcPr>
           <w:p>
@@ -5253,7 +5275,7 @@
         </w:tc>
         <w:tc>
           <w:tcPr>
-            <w:tcW w:type="dxa" w:w="3249"/>
+            <w:tcW w:type="dxa" w:w="2884"/>
             <w:shd w:val="clear" w:color="auto" w:fill="F8F9FB"/>
           </w:tcPr>
           <w:p>
@@ -5270,7 +5292,7 @@
         </w:tc>
         <w:tc>
           <w:tcPr>
-            <w:tcW w:type="dxa" w:w="3249"/>
+            <w:tcW w:type="dxa" w:w="4857"/>
             <w:shd w:val="clear" w:color="auto" w:fill="F8F9FB"/>
           </w:tcPr>
           <w:p>
@@ -5289,7 +5311,7 @@
       <w:tr>
         <w:tc>
           <w:tcPr>
-            <w:tcW w:type="dxa" w:w="3249"/>
+            <w:tcW w:type="dxa" w:w="1670"/>
           </w:tcPr>
           <w:p>
             <w:r/>
@@ -5305,7 +5327,7 @@
         </w:tc>
         <w:tc>
           <w:tcPr>
-            <w:tcW w:type="dxa" w:w="3249"/>
+            <w:tcW w:type="dxa" w:w="2884"/>
           </w:tcPr>
           <w:p>
             <w:r/>
@@ -5321,7 +5343,7 @@
         </w:tc>
         <w:tc>
           <w:tcPr>
-            <w:tcW w:type="dxa" w:w="3249"/>
+            <w:tcW w:type="dxa" w:w="4857"/>
           </w:tcPr>
           <w:p>
             <w:r/>
@@ -5339,7 +5361,7 @@
       <w:tr>
         <w:tc>
           <w:tcPr>
-            <w:tcW w:type="dxa" w:w="3249"/>
+            <w:tcW w:type="dxa" w:w="1670"/>
             <w:shd w:val="clear" w:color="auto" w:fill="F8F9FB"/>
           </w:tcPr>
           <w:p>
@@ -5356,7 +5378,7 @@
         </w:tc>
         <w:tc>
           <w:tcPr>
-            <w:tcW w:type="dxa" w:w="3249"/>
+            <w:tcW w:type="dxa" w:w="2884"/>
             <w:shd w:val="clear" w:color="auto" w:fill="F8F9FB"/>
           </w:tcPr>
           <w:p>
@@ -5373,7 +5395,7 @@
         </w:tc>
         <w:tc>
           <w:tcPr>
-            <w:tcW w:type="dxa" w:w="3249"/>
+            <w:tcW w:type="dxa" w:w="4857"/>
             <w:shd w:val="clear" w:color="auto" w:fill="F8F9FB"/>
           </w:tcPr>
           <w:p>
@@ -5392,7 +5414,7 @@
       <w:tr>
         <w:tc>
           <w:tcPr>
-            <w:tcW w:type="dxa" w:w="3249"/>
+            <w:tcW w:type="dxa" w:w="1670"/>
           </w:tcPr>
           <w:p>
             <w:r/>
@@ -5408,7 +5430,7 @@
         </w:tc>
         <w:tc>
           <w:tcPr>
-            <w:tcW w:type="dxa" w:w="3249"/>
+            <w:tcW w:type="dxa" w:w="2884"/>
           </w:tcPr>
           <w:p>
             <w:r/>
@@ -5424,7 +5446,7 @@
         </w:tc>
         <w:tc>
           <w:tcPr>
-            <w:tcW w:type="dxa" w:w="3249"/>
+            <w:tcW w:type="dxa" w:w="4857"/>
           </w:tcPr>
           <w:p>
             <w:r/>
@@ -5442,7 +5464,7 @@
       <w:tr>
         <w:tc>
           <w:tcPr>
-            <w:tcW w:type="dxa" w:w="3249"/>
+            <w:tcW w:type="dxa" w:w="1670"/>
             <w:shd w:val="clear" w:color="auto" w:fill="F8F9FB"/>
           </w:tcPr>
           <w:p>
@@ -5459,7 +5481,7 @@
         </w:tc>
         <w:tc>
           <w:tcPr>
-            <w:tcW w:type="dxa" w:w="3249"/>
+            <w:tcW w:type="dxa" w:w="2884"/>
             <w:shd w:val="clear" w:color="auto" w:fill="F8F9FB"/>
           </w:tcPr>
           <w:p>
@@ -5476,7 +5498,7 @@
         </w:tc>
         <w:tc>
           <w:tcPr>
-            <w:tcW w:type="dxa" w:w="3249"/>
+            <w:tcW w:type="dxa" w:w="4857"/>
             <w:shd w:val="clear" w:color="auto" w:fill="F8F9FB"/>
           </w:tcPr>
           <w:p>
@@ -5545,17 +5567,19 @@
         <w:tblStyle w:val="TableGrid"/>
         <w:tblW w:type="auto" w:w="0"/>
         <w:jc w:val="center"/>
+        <w:tblLayout w:type="fixed"/>
         <w:tblLook w:firstColumn="1" w:firstRow="1" w:lastColumn="0" w:lastRow="0" w:noHBand="0" w:noVBand="1" w:val="04A0"/>
+        <w:tblLayout w:type="fixed"/>
       </w:tblPr>
       <w:tblGrid>
-        <w:gridCol w:w="3249"/>
-        <w:gridCol w:w="3249"/>
-        <w:gridCol w:w="3249"/>
+        <w:gridCol w:w="1247"/>
+        <w:gridCol w:w="5556"/>
+        <w:gridCol w:w="2608"/>
       </w:tblGrid>
       <w:tr>
         <w:tc>
           <w:tcPr>
-            <w:tcW w:type="dxa" w:w="3249"/>
+            <w:tcW w:type="dxa" w:w="1247"/>
             <w:shd w:val="clear" w:color="auto" w:fill="2F3E5C"/>
           </w:tcPr>
           <w:p>
@@ -5573,7 +5597,7 @@
         </w:tc>
         <w:tc>
           <w:tcPr>
-            <w:tcW w:type="dxa" w:w="3249"/>
+            <w:tcW w:type="dxa" w:w="5556"/>
             <w:shd w:val="clear" w:color="auto" w:fill="2F3E5C"/>
           </w:tcPr>
           <w:p>
@@ -5591,7 +5615,7 @@
         </w:tc>
         <w:tc>
           <w:tcPr>
-            <w:tcW w:type="dxa" w:w="3249"/>
+            <w:tcW w:type="dxa" w:w="2608"/>
             <w:shd w:val="clear" w:color="auto" w:fill="2F3E5C"/>
           </w:tcPr>
           <w:p>
@@ -5611,7 +5635,7 @@
       <w:tr>
         <w:tc>
           <w:tcPr>
-            <w:tcW w:type="dxa" w:w="3249"/>
+            <w:tcW w:type="dxa" w:w="1247"/>
           </w:tcPr>
           <w:p>
             <w:r/>
@@ -5627,7 +5651,7 @@
         </w:tc>
         <w:tc>
           <w:tcPr>
-            <w:tcW w:type="dxa" w:w="3249"/>
+            <w:tcW w:type="dxa" w:w="5556"/>
           </w:tcPr>
           <w:p>
             <w:r/>
@@ -5643,7 +5667,7 @@
         </w:tc>
         <w:tc>
           <w:tcPr>
-            <w:tcW w:type="dxa" w:w="3249"/>
+            <w:tcW w:type="dxa" w:w="2608"/>
           </w:tcPr>
           <w:p>
             <w:r/>
@@ -5661,7 +5685,7 @@
       <w:tr>
         <w:tc>
           <w:tcPr>
-            <w:tcW w:type="dxa" w:w="3249"/>
+            <w:tcW w:type="dxa" w:w="1247"/>
             <w:shd w:val="clear" w:color="auto" w:fill="F8F9FB"/>
           </w:tcPr>
           <w:p>
@@ -5678,7 +5702,7 @@
         </w:tc>
         <w:tc>
           <w:tcPr>
-            <w:tcW w:type="dxa" w:w="3249"/>
+            <w:tcW w:type="dxa" w:w="5556"/>
             <w:shd w:val="clear" w:color="auto" w:fill="F8F9FB"/>
           </w:tcPr>
           <w:p>
@@ -5695,7 +5719,7 @@
         </w:tc>
         <w:tc>
           <w:tcPr>
-            <w:tcW w:type="dxa" w:w="3249"/>
+            <w:tcW w:type="dxa" w:w="2608"/>
             <w:shd w:val="clear" w:color="auto" w:fill="F8F9FB"/>
           </w:tcPr>
           <w:p>
@@ -5714,7 +5738,7 @@
       <w:tr>
         <w:tc>
           <w:tcPr>
-            <w:tcW w:type="dxa" w:w="3249"/>
+            <w:tcW w:type="dxa" w:w="1247"/>
           </w:tcPr>
           <w:p>
             <w:r/>
@@ -5730,7 +5754,7 @@
         </w:tc>
         <w:tc>
           <w:tcPr>
-            <w:tcW w:type="dxa" w:w="3249"/>
+            <w:tcW w:type="dxa" w:w="5556"/>
           </w:tcPr>
           <w:p>
             <w:r/>
@@ -5746,7 +5770,7 @@
         </w:tc>
         <w:tc>
           <w:tcPr>
-            <w:tcW w:type="dxa" w:w="3249"/>
+            <w:tcW w:type="dxa" w:w="2608"/>
           </w:tcPr>
           <w:p>
             <w:r/>
@@ -5764,7 +5788,7 @@
       <w:tr>
         <w:tc>
           <w:tcPr>
-            <w:tcW w:type="dxa" w:w="3249"/>
+            <w:tcW w:type="dxa" w:w="1247"/>
             <w:shd w:val="clear" w:color="auto" w:fill="F8F9FB"/>
           </w:tcPr>
           <w:p>
@@ -5781,7 +5805,7 @@
         </w:tc>
         <w:tc>
           <w:tcPr>
-            <w:tcW w:type="dxa" w:w="3249"/>
+            <w:tcW w:type="dxa" w:w="5556"/>
             <w:shd w:val="clear" w:color="auto" w:fill="F8F9FB"/>
           </w:tcPr>
           <w:p>
@@ -5798,7 +5822,7 @@
         </w:tc>
         <w:tc>
           <w:tcPr>
-            <w:tcW w:type="dxa" w:w="3249"/>
+            <w:tcW w:type="dxa" w:w="2608"/>
             <w:shd w:val="clear" w:color="auto" w:fill="F8F9FB"/>
           </w:tcPr>
           <w:p>
@@ -5817,7 +5841,7 @@
       <w:tr>
         <w:tc>
           <w:tcPr>
-            <w:tcW w:type="dxa" w:w="3249"/>
+            <w:tcW w:type="dxa" w:w="1247"/>
           </w:tcPr>
           <w:p>
             <w:r/>
@@ -5833,7 +5857,7 @@
         </w:tc>
         <w:tc>
           <w:tcPr>
-            <w:tcW w:type="dxa" w:w="3249"/>
+            <w:tcW w:type="dxa" w:w="5556"/>
           </w:tcPr>
           <w:p>
             <w:r/>
@@ -5849,7 +5873,7 @@
         </w:tc>
         <w:tc>
           <w:tcPr>
-            <w:tcW w:type="dxa" w:w="3249"/>
+            <w:tcW w:type="dxa" w:w="2608"/>
           </w:tcPr>
           <w:p>
             <w:r/>
@@ -5867,7 +5891,7 @@
       <w:tr>
         <w:tc>
           <w:tcPr>
-            <w:tcW w:type="dxa" w:w="3249"/>
+            <w:tcW w:type="dxa" w:w="1247"/>
             <w:shd w:val="clear" w:color="auto" w:fill="F8F9FB"/>
           </w:tcPr>
           <w:p>
@@ -5884,7 +5908,7 @@
         </w:tc>
         <w:tc>
           <w:tcPr>
-            <w:tcW w:type="dxa" w:w="3249"/>
+            <w:tcW w:type="dxa" w:w="5556"/>
             <w:shd w:val="clear" w:color="auto" w:fill="F8F9FB"/>
           </w:tcPr>
           <w:p>
@@ -5901,7 +5925,7 @@
         </w:tc>
         <w:tc>
           <w:tcPr>
-            <w:tcW w:type="dxa" w:w="3249"/>
+            <w:tcW w:type="dxa" w:w="2608"/>
             <w:shd w:val="clear" w:color="auto" w:fill="F8F9FB"/>
           </w:tcPr>
           <w:p>
@@ -6547,16 +6571,18 @@
         <w:tblStyle w:val="TableGrid"/>
         <w:tblW w:type="auto" w:w="0"/>
         <w:jc w:val="center"/>
+        <w:tblLayout w:type="fixed"/>
         <w:tblLook w:firstColumn="1" w:firstRow="1" w:lastColumn="0" w:lastRow="0" w:noHBand="0" w:noVBand="1" w:val="04A0"/>
+        <w:tblLayout w:type="fixed"/>
       </w:tblPr>
       <w:tblGrid>
-        <w:gridCol w:w="4873"/>
-        <w:gridCol w:w="4873"/>
+        <w:gridCol w:w="1458"/>
+        <w:gridCol w:w="7953"/>
       </w:tblGrid>
       <w:tr>
         <w:tc>
           <w:tcPr>
-            <w:tcW w:type="dxa" w:w="4873"/>
+            <w:tcW w:type="dxa" w:w="1458"/>
             <w:shd w:val="clear" w:color="auto" w:fill="2F3E5C"/>
           </w:tcPr>
           <w:p>
@@ -6574,7 +6600,7 @@
         </w:tc>
         <w:tc>
           <w:tcPr>
-            <w:tcW w:type="dxa" w:w="4873"/>
+            <w:tcW w:type="dxa" w:w="7953"/>
             <w:shd w:val="clear" w:color="auto" w:fill="2F3E5C"/>
           </w:tcPr>
           <w:p>
@@ -6594,7 +6620,7 @@
       <w:tr>
         <w:tc>
           <w:tcPr>
-            <w:tcW w:type="dxa" w:w="4873"/>
+            <w:tcW w:type="dxa" w:w="1458"/>
           </w:tcPr>
           <w:p>
             <w:r/>
@@ -6610,7 +6636,7 @@
         </w:tc>
         <w:tc>
           <w:tcPr>
-            <w:tcW w:type="dxa" w:w="4873"/>
+            <w:tcW w:type="dxa" w:w="7953"/>
           </w:tcPr>
           <w:p>
             <w:r/>
@@ -6628,7 +6654,7 @@
       <w:tr>
         <w:tc>
           <w:tcPr>
-            <w:tcW w:type="dxa" w:w="4873"/>
+            <w:tcW w:type="dxa" w:w="1458"/>
             <w:shd w:val="clear" w:color="auto" w:fill="F8F9FB"/>
           </w:tcPr>
           <w:p>
@@ -6645,7 +6671,7 @@
         </w:tc>
         <w:tc>
           <w:tcPr>
-            <w:tcW w:type="dxa" w:w="4873"/>
+            <w:tcW w:type="dxa" w:w="7953"/>
             <w:shd w:val="clear" w:color="auto" w:fill="F8F9FB"/>
           </w:tcPr>
           <w:p>
@@ -6664,7 +6690,7 @@
       <w:tr>
         <w:tc>
           <w:tcPr>
-            <w:tcW w:type="dxa" w:w="4873"/>
+            <w:tcW w:type="dxa" w:w="1458"/>
           </w:tcPr>
           <w:p>
             <w:r/>
@@ -6680,7 +6706,7 @@
         </w:tc>
         <w:tc>
           <w:tcPr>
-            <w:tcW w:type="dxa" w:w="4873"/>
+            <w:tcW w:type="dxa" w:w="7953"/>
           </w:tcPr>
           <w:p>
             <w:r/>
@@ -6698,7 +6724,7 @@
       <w:tr>
         <w:tc>
           <w:tcPr>
-            <w:tcW w:type="dxa" w:w="4873"/>
+            <w:tcW w:type="dxa" w:w="1458"/>
             <w:shd w:val="clear" w:color="auto" w:fill="F8F9FB"/>
           </w:tcPr>
           <w:p>
@@ -6715,7 +6741,7 @@
         </w:tc>
         <w:tc>
           <w:tcPr>
-            <w:tcW w:type="dxa" w:w="4873"/>
+            <w:tcW w:type="dxa" w:w="7953"/>
             <w:shd w:val="clear" w:color="auto" w:fill="F8F9FB"/>
           </w:tcPr>
           <w:p>
@@ -6734,7 +6760,7 @@
       <w:tr>
         <w:tc>
           <w:tcPr>
-            <w:tcW w:type="dxa" w:w="4873"/>
+            <w:tcW w:type="dxa" w:w="1458"/>
           </w:tcPr>
           <w:p>
             <w:r/>
@@ -6750,7 +6776,7 @@
         </w:tc>
         <w:tc>
           <w:tcPr>
-            <w:tcW w:type="dxa" w:w="4873"/>
+            <w:tcW w:type="dxa" w:w="7953"/>
           </w:tcPr>
           <w:p>
             <w:r/>
@@ -6768,7 +6794,7 @@
       <w:tr>
         <w:tc>
           <w:tcPr>
-            <w:tcW w:type="dxa" w:w="4873"/>
+            <w:tcW w:type="dxa" w:w="1458"/>
             <w:shd w:val="clear" w:color="auto" w:fill="F8F9FB"/>
           </w:tcPr>
           <w:p>
@@ -6785,7 +6811,7 @@
         </w:tc>
         <w:tc>
           <w:tcPr>
-            <w:tcW w:type="dxa" w:w="4873"/>
+            <w:tcW w:type="dxa" w:w="7953"/>
             <w:shd w:val="clear" w:color="auto" w:fill="F8F9FB"/>
           </w:tcPr>
           <w:p>
@@ -6804,7 +6830,7 @@
       <w:tr>
         <w:tc>
           <w:tcPr>
-            <w:tcW w:type="dxa" w:w="4873"/>
+            <w:tcW w:type="dxa" w:w="1458"/>
           </w:tcPr>
           <w:p>
             <w:r/>
@@ -6820,7 +6846,7 @@
         </w:tc>
         <w:tc>
           <w:tcPr>
-            <w:tcW w:type="dxa" w:w="4873"/>
+            <w:tcW w:type="dxa" w:w="7953"/>
           </w:tcPr>
           <w:p>
             <w:r/>
@@ -6838,7 +6864,7 @@
       <w:tr>
         <w:tc>
           <w:tcPr>
-            <w:tcW w:type="dxa" w:w="4873"/>
+            <w:tcW w:type="dxa" w:w="1458"/>
             <w:shd w:val="clear" w:color="auto" w:fill="F8F9FB"/>
           </w:tcPr>
           <w:p>
@@ -6855,7 +6881,7 @@
         </w:tc>
         <w:tc>
           <w:tcPr>
-            <w:tcW w:type="dxa" w:w="4873"/>
+            <w:tcW w:type="dxa" w:w="7953"/>
             <w:shd w:val="clear" w:color="auto" w:fill="F8F9FB"/>
           </w:tcPr>
           <w:p>
@@ -6874,7 +6900,7 @@
       <w:tr>
         <w:tc>
           <w:tcPr>
-            <w:tcW w:type="dxa" w:w="4873"/>
+            <w:tcW w:type="dxa" w:w="1458"/>
           </w:tcPr>
           <w:p>
             <w:r/>
@@ -6890,7 +6916,7 @@
         </w:tc>
         <w:tc>
           <w:tcPr>
-            <w:tcW w:type="dxa" w:w="4873"/>
+            <w:tcW w:type="dxa" w:w="7953"/>
           </w:tcPr>
           <w:p>
             <w:r/>

</xml_diff>